<commit_message>
deploy 0d37757 (R2-P0, hook run 2026-09-05 08:39 UTC, exit 0, 906 PASS)
</commit_message>
<xml_diff>
--- a/memos/plan_consulting_alumni__amg_pantheon_committee_packet.docx
+++ b/memos/plan_consulting_alumni__amg_pantheon_committee_packet.docx
@@ -41,7 +41,7 @@
     </w:p>
     <w:p>
       <w:r>
-        <w:t>Benchmark: Peer cohort composite: evergreen_pe without amg_pantheon (ares_pmf, hl_paf, kkr_kpec, stepstone_spm) at 10/12, KS-PME 0.8357, Direct Alpha -3.53%/yr over FY2022 to FY2026.</w:t>
+        <w:t>Benchmark: Peer composite, evergreen private equity cohort without AMG Pantheon Fund, LLC (members: Ares Private Markets Fund, Hamilton Lane Private Assets Fund, KKR Private Equity Conglomerate LLC, StepStone Private Markets) at 9/12, relative wealth ratio 0.8357 vs the peer composite, annualized excess return -3.53%/yr (not a public market equivalent) over FY2022 to FY2026.</w:t>
       </w:r>
     </w:p>
     <w:p>
@@ -77,7 +77,7 @@
     </w:p>
     <w:p>
       <w:r>
-        <w:t>Rubric v2, threshold 7 of 12, strategy gate. Max attainable on held data 10/12.</w:t>
+        <w:t>Tark benchmark rubric, 12 points, threshold 7 of 12, strategy gate. Max attainable on held data 9/12.</w:t>
       </w:r>
     </w:p>
     <w:tbl>
@@ -151,7 +151,7 @@
           </w:tcPr>
           <w:p>
             <w:r>
-              <w:t>Peer cohort composite: evergreen_pe without amg_pantheon (ares_pmf, hl_paf, kkr_kpec, stepstone_spm)</w:t>
+              <w:t>Peer composite, evergreen private equity cohort without AMG Pantheon Fund, LLC (members: Ares Private Markets Fund, Hamilton Lane Private Assets Fund, KKR Private Equity Conglomerate LLC, StepStone Private Markets)</w:t>
             </w:r>
           </w:p>
         </w:tc>
@@ -161,7 +161,7 @@
           </w:tcPr>
           <w:p>
             <w:r>
-              <w:t>10/12</w:t>
+              <w:t>9/12</w:t>
             </w:r>
           </w:p>
         </w:tc>
@@ -171,7 +171,7 @@
           </w:tcPr>
           <w:p>
             <w:r>
-              <w:t>KS-PME 0.8357, Direct Alpha -3.53%/yr, FY2022 to FY2026</w:t>
+              <w:t>relative wealth ratio 0.8357 vs the peer composite, annualized excess return -3.53%/yr (not a public market equivalent), FY2022 to FY2026</w:t>
             </w:r>
           </w:p>
         </w:tc>
@@ -297,7 +297,7 @@
           </w:tcPr>
           <w:p>
             <w:r>
-              <w:t>outranked: score 7/12 vs primary 10/12 and secondary 9/12 (only two slots). Retained in log as viable alternate</w:t>
+              <w:t>outranked: score 7/12 vs primary 9/12 and secondary 9/12 (only two slots). Retained in log as viable alternate</w:t>
             </w:r>
           </w:p>
         </w:tc>
@@ -308,7 +308,7 @@
         <w:pStyle w:val="Heading1"/>
       </w:pPr>
       <w:r>
-        <w:t>Exhibit B.</w:t>
+        <w:t>Exhibit B. Liquidity match for this plan</w:t>
       </w:r>
     </w:p>
     <w:p>
@@ -342,7 +342,7 @@
         <w:pStyle w:val="ListBullet"/>
       </w:pPr>
       <w:r>
-        <w:t>STRUCTURAL GAP (narrowed): this plan is PARTIALLY participant-directed per its own Form 5500 codes (2H, no 2G/404(c) code filed). A trustee-directed sleeve could hold this wrapper directly, and the daily-menu constraint (this wrapper deals 4x/year) applies only to the participant-directed portion (cell 3.5).</w:t>
+        <w:t>STRUCTURAL GAP (narrowed): this plan is PARTIALLY participant-directed per its own Form 5500 codes (2H, no 2G/404(c) code filed). A trustee-directed sleeve could hold this wrapper directly (cell 3.5), and the daily-menu constraint applies only to the participant-directed portion, where the menu assumes daily liquidity whereas this wrapper deals quarterly with a 5% cap per quarter on outstanding shares.</w:t>
       </w:r>
     </w:p>
     <w:p>
@@ -413,7 +413,7 @@
           </w:tcPr>
           <w:p>
             <w:r>
-              <w:t>tender_offer</w:t>
+              <w:t>tender-offer fund</w:t>
             </w:r>
           </w:p>
         </w:tc>
@@ -435,7 +435,7 @@
           </w:tcPr>
           <w:p>
             <w:r>
-              <w:t>Dealing cadence per year</w:t>
+              <w:t>Dealing terms</w:t>
             </w:r>
           </w:p>
         </w:tc>
@@ -445,7 +445,7 @@
           </w:tcPr>
           <w:p>
             <w:r>
-              <w:t>4</w:t>
+              <w:t>quarterly offers, 5% cap per quarter on outstanding shares</w:t>
             </w:r>
           </w:p>
         </w:tc>
@@ -455,7 +455,7 @@
           </w:tcPr>
           <w:p>
             <w:r>
-              <w:t>3.3</w:t>
+              <w:t>3.1</w:t>
             </w:r>
           </w:p>
         </w:tc>
@@ -467,7 +467,7 @@
           </w:tcPr>
           <w:p>
             <w:r>
-              <w:t>Repurchase cap</w:t>
+              <w:t>Repurchase caps</w:t>
             </w:r>
           </w:p>
         </w:tc>
@@ -477,7 +477,7 @@
           </w:tcPr>
           <w:p>
             <w:r>
-              <w:t>5% of outstanding shares</w:t>
+              <w:t>5% per quarter, 20% per year</w:t>
             </w:r>
           </w:p>
         </w:tc>
@@ -487,7 +487,39 @@
           </w:tcPr>
           <w:p>
             <w:r>
-              <w:t>3.3</w:t>
+              <w:t>3.1</w:t>
+            </w:r>
+          </w:p>
+        </w:tc>
+      </w:tr>
+      <w:tr>
+        <w:tc>
+          <w:tcPr>
+            <w:tcW w:type="dxa" w:w="2448"/>
+          </w:tcPr>
+          <w:p>
+            <w:r>
+              <w:t>Annual capacity (binding cap)</w:t>
+            </w:r>
+          </w:p>
+        </w:tc>
+        <w:tc>
+          <w:tcPr>
+            <w:tcW w:type="dxa" w:w="5760"/>
+          </w:tcPr>
+          <w:p>
+            <w:r>
+              <w:t>20% of the position per year</w:t>
+            </w:r>
+          </w:p>
+        </w:tc>
+        <w:tc>
+          <w:tcPr>
+            <w:tcW w:type="dxa" w:w="1152"/>
+          </w:tcPr>
+          <w:p>
+            <w:r>
+              <w:t>3.1</w:t>
             </w:r>
           </w:p>
         </w:tc>
@@ -622,7 +654,7 @@
         <w:pStyle w:val="ListBullet"/>
       </w:pPr>
       <w:r>
-        <w:t>Capacity: 4x per year at 5% of outstanding shares: at most 20% of the position per year. This is a FUND-level cap shared by every holder, so the plan's position is served only while offers are not oversubscribed.</w:t>
+        <w:t>Capacity: 5% per quarter on outstanding shares: at most 20% of the position per year. This is a FUND-level cap shared by every holder, so the plan's position is served only while offers are not oversubscribed.</w:t>
       </w:r>
     </w:p>
     <w:p>
@@ -630,7 +662,7 @@
         <w:pStyle w:val="ListBullet"/>
       </w:pPr>
       <w:r>
-        <w:t>Scenario demand (illustrative): 13.7% of the position per year vs 20% annual wrapper capacity. THIN HEADROOM: demand consumes over 60% of wrapper capacity, so proration in any oversubscribed quarter would push the shortfall into the next window.</w:t>
+        <w:t>Scenario demand (illustrative): 13.7% of the position per year vs 20% annual wrapper capacity. THIN HEADROOM: demand consumes over 60% of wrapper capacity, so proration in any oversubscribed window would push the shortfall into the next window.</w:t>
       </w:r>
     </w:p>
     <w:p>
@@ -646,12 +678,12 @@
         <w:pStyle w:val="ListBullet"/>
       </w:pPr>
       <w:r>
-        <w:t>Schedule H benefit payments (line 2e) not typed: the DOL bulk file F_SCH_H_2024_latest.csv is not in the repository and askebsa.dol.gov is blocked from the build container. Fill from the bulk file on a machine with access, citing the row. Demand uses the illustrative turnover sliders only.</w:t>
+        <w:t>Schedule H benefit-payment lines are not yet in the plan record. Demand uses the illustrative turnover sliders only.</w:t>
       </w:r>
     </w:p>
     <w:p>
       <w:r>
-        <w:t>Cited: cell 3.1, cell 3.3, cell 3.5, cell 3.7, cell 3.9, cell 2.7, plan: plan_consulting_alumni.json (Form 5500, plan year 2024-01-01 to 2024-12-31).</w:t>
+        <w:t>Cited: cell 2.7, cell 3.1, cell 3.3, plan: plan_consulting_alumni.json (Form 5500, plan year 2024-01-01 to 2024-12-31).</w:t>
       </w:r>
     </w:p>
     <w:p>
@@ -791,7 +823,7 @@
           </w:tcPr>
           <w:p>
             <w:r>
-              <w:t>2.38% net expense ratio</w:t>
+              <w:t>2.38% expense ratio, total annual expenses of the inception class, classes range 2.38% to 3.38%</w:t>
             </w:r>
           </w:p>
         </w:tc>
@@ -855,7 +887,7 @@
           </w:tcPr>
           <w:p>
             <w:r>
-              <w:t>extracted</w:t>
+              <w:t>no typed fact for this cell</w:t>
             </w:r>
           </w:p>
         </w:tc>
@@ -950,7 +982,7 @@
     </w:p>
     <w:p>
       <w:r>
-        <w:t>Cohort placement (evergreen_pe, R4 phrasing): mgmt fee: 10th percentile of cohort (n=5), below the median of 1.4 | expense ratio (bases differ, see notes): 30th percentile of cohort (n=5), below the median of 3.19 | repurchase cap: 50th percentile of cohort (n=5), at the median of 5. Stats and per-member values in data/cohorts/evergreen_pe.json, membership rationales in data/facts.</w:t>
+        <w:t>Cohort placement (evergreen private equity cohort): mgmt fee: 10th percentile of cohort (n=5), below the median of 1.4 | expense ratio (bases differ, see notes): 30th percentile of cohort (n=5), below the median of 3.19 | repurchase cap: 50th percentile of cohort (n=5), at the median of 5. Statistics and per-member values are in the cohort artifact, membership rationales in the typed facts.</w:t>
       </w:r>
     </w:p>
     <w:p>
@@ -1010,7 +1042,7 @@
     </w:p>
     <w:p>
       <w:r>
-        <w:t>Regulatory basis: Fiduciary Duties in Selecting Designated Investment Alternatives, 91 FR 16088 (Mar. 31, 2026), RIN 1210-AC38, proposed 29 CFR 2550.404a-6, paragraphs (g) to (l), cited not paraphrased. Every figure above is a cited cell, a typed projection of one, or an engine artifact of the record as of 2026-09-04. Scenario figures are ILLUSTRATIVE. Sponsor name NEVER appears on demo surfaces. Data is public (DOL Form 5500 FOIA files); anonymization is a project display rule, not a legal requirement.</w:t>
+        <w:t>Regulatory basis: Fiduciary Duties in Selecting Designated Investment Alternatives, 91 FR 16088 (Mar. 31, 2026), RIN 1210-AC38, proposed 29 CFR 2550.404a-6, paragraphs (g) to (l), cited not paraphrased. Every figure above is a cited cell, a typed projection of one, or an engine artifact of the record as of 2026-09-04. Scenario figures are ILLUSTRATIVE. The plan is shown under its anonymized label.</w:t>
       </w:r>
     </w:p>
     <w:sectPr>

</xml_diff>

<commit_message>
deploy 95f2e28 (R2-P1 and R2-P2-1 to R2-P2-3, hook run 2026-09-07 07:05 UTC, exit 0, 1048 PASS)
Co-Authored-By: Claude Fable 5.1 <noreply@anthropic.com>
Claude-Session: https://claude.ai/code/session_01RodaAaPtAYCnL4zHjsnrEG
</commit_message>
<xml_diff>
--- a/memos/plan_consulting_alumni__amg_pantheon_committee_packet.docx
+++ b/memos/plan_consulting_alumni__amg_pantheon_committee_packet.docx
@@ -36,12 +36,22 @@
     </w:p>
     <w:p>
       <w:r>
-        <w:t>Structural liquidity verdict: CONDITIONAL (typed facts, plan-independent). Scenario verdict under this plan (ILLUSTRATIVE, default sliders): CONDITIONAL-WEAK.</w:t>
+        <w:t>Structural liquidity verdict: PARTIAL (typed facts, plan-independent). Scenario verdict under this plan (ILLUSTRATIVE, default sliders): CONDITIONAL.</w:t>
       </w:r>
     </w:p>
     <w:p>
       <w:r>
-        <w:t>Benchmark: Peer composite, evergreen private equity cohort without AMG Pantheon Fund, LLC (members: Ares Private Markets Fund, Hamilton Lane Private Assets Fund, KKR Private Equity Conglomerate LLC, StepStone Private Markets) at 9/12, relative wealth ratio 0.8357 vs the peer composite, annualized excess return -3.53%/yr (not a public market equivalent) over FY2022 to FY2026.</w:t>
+        <w:t>Meaningful benchmark (paragraph (k)): Cambridge Associates US PE benchmark at 9/12, no comparison computed (cited, series not in the record: no comparison computed).</w:t>
+      </w:r>
+    </w:p>
+    <w:p>
+      <w:r>
+        <w:t>Reference comparison, not the meaningful benchmark: Listed private equity investable proxy (PSP), KS-PME 1.5919, Direct Alpha 6.87%/yr over 2019-03-31 to 2026-03-31.</w:t>
+      </w:r>
+    </w:p>
+    <w:p>
+      <w:r>
+        <w:t>Peer comparison (paragraphs (g) and (h)): composite refused, members report on different year ends and no member has a series that builds a common calendar period (Hamilton Lane Private Assets Fund fiscal years to month 03, StepStone Private Markets fiscal years to month 03, KKR Private Equity Conglomerate LLC calendar years, Ares Private Markets Fund fiscal years to month 03, AMG Pantheon Fund, LLC fiscal years to month 03). A composite needs identical start and end dates for every member.</w:t>
       </w:r>
     </w:p>
     <w:p>
@@ -54,12 +64,28 @@
         <w:pStyle w:val="ListBullet"/>
       </w:pPr>
       <w:r>
-        <w:t>Liquidity: ILLUSTRATIVE scenario verdict conditional-weak under this plan (base or stressed demand above wrapper capacity)</w:t>
+        <w:t>Benchmark: the meaningful benchmark carries no computed comparison (cited, series not in the record: no comparison computed) (benchmark selection)</w:t>
+      </w:r>
+    </w:p>
+    <w:p>
+      <w:pPr>
+        <w:pStyle w:val="ListBullet"/>
+      </w:pPr>
+      <w:r>
+        <w:t>Peer comparison: composite refused, members report on different year ends and no member has a series that builds a common calendar period (Hamilton Lane Private Assets Fund fiscal years to month 03, StepStone Private Markets fiscal years to month 03, KKR Private Equity Conglomerate LLC calendar years, Ares Private Markets Fund fiscal years to month 03, AMG Pantheon Fund, LLC fiscal years to month 03). A composite needs identical start and end dates for every member (cell 1.12)</w:t>
+      </w:r>
+    </w:p>
+    <w:p>
+      <w:pPr>
+        <w:pStyle w:val="ListBullet"/>
+      </w:pPr>
+      <w:r>
+        <w:t>Liquidity: structural verdict partial, facts missing: gate_history (cells 3.1, 3.3)</w:t>
       </w:r>
     </w:p>
     <w:p>
       <w:r>
-        <w:t>Evidence coverage: 40 of 40 resolvable, 0 verified, 14 n/a by wrapper. Verified by a person: 0. Advisor-stated inputs for this plan: 0 of 6.</w:t>
+        <w:t>Evidence coverage: 42 of 42 resolvable, 0 verified, 13 n/a by wrapper. Verified by a person: 0. Advisor-stated inputs for this plan: 0 of 6.</w:t>
       </w:r>
     </w:p>
     <w:p>
@@ -77,7 +103,7 @@
     </w:p>
     <w:p>
       <w:r>
-        <w:t>Tark benchmark rubric, 12 points, threshold 7 of 12, strategy gate. Max attainable on held data 9/12.</w:t>
+        <w:t>Tark benchmark rubric, 12 points, threshold 7 of 12, strategy gate, affiliated providers ineligible. Max attainable by an eligible candidate on held data 9/12.</w:t>
       </w:r>
     </w:p>
     <w:tbl>
@@ -141,7 +167,7 @@
           </w:tcPr>
           <w:p>
             <w:r>
-              <w:t>primary</w:t>
+              <w:t>Meaningful benchmark (paragraph (k))</w:t>
             </w:r>
           </w:p>
         </w:tc>
@@ -151,7 +177,7 @@
           </w:tcPr>
           <w:p>
             <w:r>
-              <w:t>Peer composite, evergreen private equity cohort without AMG Pantheon Fund, LLC (members: Ares Private Markets Fund, Hamilton Lane Private Assets Fund, KKR Private Equity Conglomerate LLC, StepStone Private Markets)</w:t>
+              <w:t>Cambridge Associates US PE benchmark</w:t>
             </w:r>
           </w:p>
         </w:tc>
@@ -171,7 +197,7 @@
           </w:tcPr>
           <w:p>
             <w:r>
-              <w:t>relative wealth ratio 0.8357 vs the peer composite, annualized excess return -3.53%/yr (not a public market equivalent), FY2022 to FY2026</w:t>
+              <w:t>selected, no comparison computed: cited, series not in the record: no comparison computed</w:t>
             </w:r>
           </w:p>
         </w:tc>
@@ -183,7 +209,7 @@
           </w:tcPr>
           <w:p>
             <w:r>
-              <w:t>secondary</w:t>
+              <w:t>reference, not the benchmark</w:t>
             </w:r>
           </w:p>
         </w:tc>
@@ -203,7 +229,7 @@
           </w:tcPr>
           <w:p>
             <w:r>
-              <w:t>9/12</w:t>
+              <w:t>8/12</w:t>
             </w:r>
           </w:p>
         </w:tc>
@@ -214,6 +240,130 @@
           <w:p>
             <w:r>
               <w:t>KS-PME 1.5919, Direct Alpha 6.87%/yr, 2019-03-31 to 2026-03-31</w:t>
+            </w:r>
+          </w:p>
+        </w:tc>
+      </w:tr>
+      <w:tr>
+        <w:tc>
+          <w:tcPr>
+            <w:tcW w:type="dxa" w:w="1152"/>
+          </w:tcPr>
+          <w:p>
+            <w:r>
+              <w:t>SEC-required comparator</w:t>
+            </w:r>
+          </w:p>
+        </w:tc>
+        <w:tc>
+          <w:tcPr>
+            <w:tcW w:type="dxa" w:w="3456"/>
+          </w:tcPr>
+          <w:p>
+            <w:r>
+              <w:t>MSCI World Index</w:t>
+            </w:r>
+          </w:p>
+        </w:tc>
+        <w:tc>
+          <w:tcPr>
+            <w:tcW w:type="dxa" w:w="864"/>
+          </w:tcPr>
+          <w:p>
+            <w:r/>
+          </w:p>
+        </w:tc>
+        <w:tc>
+          <w:tcPr>
+            <w:tcW w:type="dxa" w:w="3888"/>
+          </w:tcPr>
+          <w:p>
+            <w:r>
+              <w:t>held, scored 7/12, fails the strategy gate (strategy_match 1/3). KS-PME 1.0483, Direct Alpha 0.68%/yr, 2019-03-31 to 2026-03-31</w:t>
+            </w:r>
+          </w:p>
+        </w:tc>
+      </w:tr>
+      <w:tr>
+        <w:tc>
+          <w:tcPr>
+            <w:tcW w:type="dxa" w:w="1152"/>
+          </w:tcPr>
+          <w:p>
+            <w:r>
+              <w:t>Peer comparison (paragraphs (g) and (h))</w:t>
+            </w:r>
+          </w:p>
+        </w:tc>
+        <w:tc>
+          <w:tcPr>
+            <w:tcW w:type="dxa" w:w="3456"/>
+          </w:tcPr>
+          <w:p>
+            <w:r>
+              <w:t>Peer composite, evergreen private equity cohort without AMG Pantheon Fund, LLC</w:t>
+            </w:r>
+          </w:p>
+        </w:tc>
+        <w:tc>
+          <w:tcPr>
+            <w:tcW w:type="dxa" w:w="864"/>
+          </w:tcPr>
+          <w:p>
+            <w:r>
+              <w:t>not scored</w:t>
+            </w:r>
+          </w:p>
+        </w:tc>
+        <w:tc>
+          <w:tcPr>
+            <w:tcW w:type="dxa" w:w="3888"/>
+          </w:tcPr>
+          <w:p>
+            <w:r>
+              <w:t>composite refused: members report on different year ends and no member has a series that builds a common calendar period (Hamilton Lane Private Assets Fund fiscal years to month 03, StepStone Private Markets fiscal years to month 03, KKR Private Equity Conglomerate LLC calendar years, Ares Private Markets Fund fiscal years to month 03, AMG Pantheon Fund, LLC fiscal years to month 03). A composite needs identical start and end dates for every member</w:t>
+            </w:r>
+          </w:p>
+        </w:tc>
+      </w:tr>
+      <w:tr>
+        <w:tc>
+          <w:tcPr>
+            <w:tcW w:type="dxa" w:w="1152"/>
+          </w:tcPr>
+          <w:p>
+            <w:r>
+              <w:t>rejected</w:t>
+            </w:r>
+          </w:p>
+        </w:tc>
+        <w:tc>
+          <w:tcPr>
+            <w:tcW w:type="dxa" w:w="3456"/>
+          </w:tcPr>
+          <w:p>
+            <w:r>
+              <w:t>Listed private equity investable proxy (PSP)</w:t>
+            </w:r>
+          </w:p>
+        </w:tc>
+        <w:tc>
+          <w:tcPr>
+            <w:tcW w:type="dxa" w:w="864"/>
+          </w:tcPr>
+          <w:p>
+            <w:r>
+              <w:t>8/12</w:t>
+            </w:r>
+          </w:p>
+        </w:tc>
+        <w:tc>
+          <w:tcPr>
+            <w:tcW w:type="dxa" w:w="3888"/>
+          </w:tcPr>
+          <w:p>
+            <w:r>
+              <w:t>ranked below the selected candidate: 8/12 vs 9/12 for Cambridge PE benchmark</w:t>
             </w:r>
           </w:p>
         </w:tc>
@@ -245,48 +395,6 @@
           </w:tcPr>
           <w:p>
             <w:r>
-              <w:t>8/12</w:t>
-            </w:r>
-          </w:p>
-        </w:tc>
-        <w:tc>
-          <w:tcPr>
-            <w:tcW w:type="dxa" w:w="3888"/>
-          </w:tcPr>
-          <w:p>
-            <w:r>
-              <w:t>rejected: strategy gate (score 8/12 but strategy_match 1/3)</w:t>
-            </w:r>
-          </w:p>
-        </w:tc>
-      </w:tr>
-      <w:tr>
-        <w:tc>
-          <w:tcPr>
-            <w:tcW w:type="dxa" w:w="1152"/>
-          </w:tcPr>
-          <w:p>
-            <w:r>
-              <w:t>rejected</w:t>
-            </w:r>
-          </w:p>
-        </w:tc>
-        <w:tc>
-          <w:tcPr>
-            <w:tcW w:type="dxa" w:w="3456"/>
-          </w:tcPr>
-          <w:p>
-            <w:r>
-              <w:t>Cambridge Associates US PE benchmark</w:t>
-            </w:r>
-          </w:p>
-        </w:tc>
-        <w:tc>
-          <w:tcPr>
-            <w:tcW w:type="dxa" w:w="864"/>
-          </w:tcPr>
-          <w:p>
-            <w:r>
               <w:t>7/12</w:t>
             </w:r>
           </w:p>
@@ -297,7 +405,7 @@
           </w:tcPr>
           <w:p>
             <w:r>
-              <w:t>outranked: score 7/12 vs primary 9/12 and secondary 9/12 (only two slots). Retained in log as viable alternate</w:t>
+              <w:t>rejected: strategy gate (score 7/12 but strategy_match 1/3)</w:t>
             </w:r>
           </w:p>
         </w:tc>
@@ -312,16 +420,8 @@
       </w:r>
     </w:p>
     <w:p>
-      <w:pPr>
-        <w:pStyle w:val="Heading1"/>
-      </w:pPr>
       <w:r>
-        <w:t>Product-to-plan liquidity match</w:t>
-      </w:r>
-    </w:p>
-    <w:p>
-      <w:r>
-        <w:t>Plan: Global management-consulting firm profit-sharing/401(k) plan (~$9.8B, NY). verdict is structural (typed facts, cells 3.1, 3.3, 2.7, plan-independent). scenario_verdict is ILLUSTRATIVE (demand model against the same capacity, per plan).</w:t>
+        <w:t>Plan: Global management-consulting firm profit-sharing/401(k) plan (~$9.8B, NY). verdict is structural (typed facts, cells 3.1, 3.3, 2.7, plan-independent). scenario_verdict is ILLUSTRATIVE (the plan's filed outflow proxy as the base demand and the sliders as the stress, against the same capacity, per plan).</w:t>
       </w:r>
     </w:p>
     <w:p>
@@ -334,7 +434,7 @@
     </w:p>
     <w:p>
       <w:r>
-        <w:t>CONDITIONAL</w:t>
+        <w:t>PARTIAL</w:t>
       </w:r>
     </w:p>
     <w:p>
@@ -343,6 +443,14 @@
       </w:pPr>
       <w:r>
         <w:t>STRUCTURAL GAP (narrowed): this plan is PARTIALLY participant-directed per its own Form 5500 codes (2H, no 2G/404(c) code filed). A trustee-directed sleeve could hold this wrapper directly (cell 3.5), and the daily-menu constraint applies only to the participant-directed portion, where the menu assumes daily liquidity whereas this wrapper deals quarterly with a 5% cap per quarter on outstanding shares.</w:t>
+      </w:r>
+    </w:p>
+    <w:p>
+      <w:pPr>
+        <w:pStyle w:val="ListBullet"/>
+      </w:pPr>
+      <w:r>
+        <w:t>Facts missing for a structural verdict: gate_history (no proration or oversubscription event is disclosed in the on-disk documents, but the tendered-versus-accepted amounts per offer are not printed either. Completed-tender dollars establish continuity, not full fills (R2-P1-12 rule)). The verdict stays partial until they are typed from the filings.</w:t>
       </w:r>
     </w:p>
     <w:p>
@@ -541,7 +649,7 @@
           </w:tcPr>
           <w:p>
             <w:r>
-              <w:t>none identified in the filings on record</w:t>
+              <w:t>not typed: no proration or oversubscription event is disclosed in the on-disk documents, but the tendered-versus-accepted amounts per offer are not printed either. Completed-tender dollars establish continuity, not full fills (R2-P1-12 rule)</w:t>
             </w:r>
           </w:p>
         </w:tc>
@@ -620,6 +728,38 @@
           </w:p>
         </w:tc>
       </w:tr>
+      <w:tr>
+        <w:tc>
+          <w:tcPr>
+            <w:tcW w:type="dxa" w:w="2448"/>
+          </w:tcPr>
+          <w:p>
+            <w:r>
+              <w:t>Fund net assets (for the dollar capacity)</w:t>
+            </w:r>
+          </w:p>
+        </w:tc>
+        <w:tc>
+          <w:tcPr>
+            <w:tcW w:type="dxa" w:w="5760"/>
+          </w:tcPr>
+          <w:p>
+            <w:r>
+              <w:t>not typed: aggregate net assets not yet carried into a typed cell. Verification-queue item</w:t>
+            </w:r>
+          </w:p>
+        </w:tc>
+        <w:tc>
+          <w:tcPr>
+            <w:tcW w:type="dxa" w:w="1152"/>
+          </w:tcPr>
+          <w:p>
+            <w:r>
+              <w:t>3.6</w:t>
+            </w:r>
+          </w:p>
+        </w:tc>
+      </w:tr>
     </w:tbl>
     <w:p>
       <w:pPr>
@@ -631,22 +771,32 @@
     </w:p>
     <w:p>
       <w:r>
-        <w:t>Plan inputs (Form 5500): net assets $9.8B, liquidity tail 58.2% of accounts (20,253 separated participants with balances).</w:t>
+        <w:t>Plan inputs (Form 5500): net assets $9.8B, liquidity tail 58.2% of accounts (20,253 separated participants with balances), filed outflow proxy 6.5% of beginning net assets per year (Schedule H totals of the plan's Form 5500 for plan year 2024-01-01 to 2024-12-31, from the plan record: total expenses less administrative expenses over beginning net assets, an upper bound on benefit payments while Schedule H line 2e is not in the record).</w:t>
       </w:r>
     </w:p>
     <w:p>
       <w:r>
-        <w:t>Parameters (adjustable on the site, not facts): allocation 5% of plan = $490.5M, tail turnover 20%/yr, active turnover 5%/yr. Base demand $67.3M/yr = 13.7% of the position vs annual wrapper capacity 20%.</w:t>
+        <w:t>Base demand (filed outflow proxy applied to a 5% allocation = $490.5M): $31.9M/yr = 6.5% of the position per year vs annual wrapper capacity 20%.</w:t>
       </w:r>
     </w:p>
     <w:p>
       <w:r>
-        <w:t>Stressed (tail turnover x2, active turnover x1.5 vs base scenario): demand $129.5M/yr = 26.4% of the position. EXCEEDS annual wrapper capacity. Unmet demand rolls into later windows (gating-equivalent outcome).</w:t>
+        <w:t>Slider assumption (adjustable on the site, not a fact): tail turnover 20%/yr, active turnover 5%/yr, 13.7% of the position per year = $67.3M/yr, shown beside the filed rate, not blended with it.</w:t>
       </w:r>
     </w:p>
     <w:p>
       <w:r>
-        <w:t>Scenario verdict (ILLUSTRATIVE, this plan): CONDITIONAL-WEAK.</w:t>
+        <w:t>Stressed (the filed outflow proxy plus the increment the sliders add under stress (tail turnover x2, active turnover x1.5 over the slider assumption)): demand $94.1M/yr = 19.2% of the position. within wrapper capacity (19.2% vs 20%) IF offers are not prorated.</w:t>
+      </w:r>
+    </w:p>
+    <w:p>
+      <w:r>
+        <w:t>Fund capacity in dollars: not computable, the fund's net assets are not typed in the record (aggregate net assets not yet carried into a typed cell. Verification-queue item), so the plan's dollar demand cannot be set against the fund's dollar capacity and the allocation slider is not shown.</w:t>
+      </w:r>
+    </w:p>
+    <w:p>
+      <w:r>
+        <w:t>Scenario verdict (ILLUSTRATIVE, this plan): CONDITIONAL.</w:t>
       </w:r>
     </w:p>
     <w:p>
@@ -662,7 +812,7 @@
         <w:pStyle w:val="ListBullet"/>
       </w:pPr>
       <w:r>
-        <w:t>Scenario demand (illustrative): 13.7% of the position per year vs 20% annual wrapper capacity. THIN HEADROOM: demand consumes over 60% of wrapper capacity, so proration in any oversubscribed window would push the shortfall into the next window.</w:t>
+        <w:t>Filed outflow proxy (Schedule H, plan year 2024-01-01 to 2024-12-31): 6.5% of the position per year vs 20% annual wrapper capacity, the plan's total expenses less administrative expenses over beginning net assets, applied to the position. Adequate headroom at the filed rate if offers are not prorated.</w:t>
       </w:r>
     </w:p>
     <w:p>
@@ -670,7 +820,7 @@
         <w:pStyle w:val="ListBullet"/>
       </w:pPr>
       <w:r>
-        <w:t>Scenario verdict (ILLUSTRATIVE, this plan): conditional-weak. It moves with the sliders and the plan. Proration assumption: an oversubscribed offer is filled pro rata and the unfilled remainder waits for the next window.</w:t>
+        <w:t>Slider assumption (illustrative): 13.7% of the position per year vs 20% annual wrapper capacity, from tail turnover 20%/yr on the 58.2% of accounts that are separated and active turnover 5%/yr on the rest. Shown beside the filed rate, not blended with it. THIN HEADROOM: the slider assumption consumes over 60% of wrapper capacity, so proration in any oversubscribed window would push the shortfall into the next window.</w:t>
       </w:r>
     </w:p>
     <w:p>
@@ -678,12 +828,20 @@
         <w:pStyle w:val="ListBullet"/>
       </w:pPr>
       <w:r>
-        <w:t>Schedule H benefit-payment lines are not yet in the plan record. Demand uses the illustrative turnover sliders only.</w:t>
+        <w:t>Scenario verdict (ILLUSTRATIVE, this plan): conditional. Misaligned when the filed outflow proxy exceeds the annual wrapper capacity, conditional-weak when the stressed demand exceeds it, conditional otherwise. It moves with the plan's filing and the sliders. Proration assumption: an oversubscribed offer is filled pro rata and the unfilled remainder waits for the next window.</w:t>
+      </w:r>
+    </w:p>
+    <w:p>
+      <w:pPr>
+        <w:pStyle w:val="ListBullet"/>
+      </w:pPr>
+      <w:r>
+        <w:t>Schedule H benefit-payment line 2e is not yet in the plan record. The filed outflow proxy (total expenses less administrative expenses over beginning net assets) stands in for it as the base demand, and the turnover sliders are the stress around it.</w:t>
       </w:r>
     </w:p>
     <w:p>
       <w:r>
-        <w:t>Cited: cell 2.7, cell 3.1, cell 3.3, plan: plan_consulting_alumni.json (Form 5500, plan year 2024-01-01 to 2024-12-31).</w:t>
+        <w:t>Cited: cell 2.7, cell 3.1, cell 3.3, cell 3.7, plan: plan_consulting_alumni.json (Form 5500, plan year 2024-01-01 to 2024-12-31).</w:t>
       </w:r>
     </w:p>
     <w:p>
@@ -1037,7 +1195,7 @@
     </w:p>
     <w:p>
       <w:r>
-        <w:t>Cell status for this product: structured 0, extracted-unverified 27, verified 0, computed 9, partial 3, fetched 1, n/a 14, pending 0.</w:t>
+        <w:t>Cell status for this product: structured 0, extracted-unverified 27, verified 0, computed 11, partial 3, fetched 1, n/a 13, pending 0.</w:t>
       </w:r>
     </w:p>
     <w:p>

</xml_diff>